<commit_message>
Manual: 'Antes de empezar' queda solo con el ajuste de Excel, explicado
Co-Authored-By: Claude Opus 5.5 <noreply@anthropic.com>
Claude-Session: https://claude.ai/code/session_01QJWgEXmqyriCBgoaHW8q44
</commit_message>
<xml_diff>
--- a/Manual de uso — Enlace XBRL.docx
+++ b/Manual de uso — Enlace XBRL.docx
@@ -283,7 +283,7 @@
         <w:pStyle w:val="Heading1"/>
       </w:pPr>
       <w:r>
-        <w:t>Antes de empezar: lo que necesitas</w:t>
+        <w:t>Antes de empezar: un ajuste de Excel (una sola vez)</w:t>
       </w:r>
     </w:p>
     <w:p>
@@ -292,7 +292,83 @@
           <w:b w:val="0"/>
           <w:i w:val="0"/>
         </w:rPr>
-        <w:t>Revisa esta lista una vez, antes del primer uso en cada computador.</w:t>
+        <w:t>Antes de usar la app por primera vez en un computador hay que cambiar un ajuste de Excel. Se hace una sola vez en cada computador y toma un minuto.</w:t>
+      </w:r>
+    </w:p>
+    <w:p>
+      <w:pPr>
+        <w:pStyle w:val="Heading2"/>
+      </w:pPr>
+      <w:r>
+        <w:t>Por qué hace falta</w:t>
+      </w:r>
+    </w:p>
+    <w:p>
+      <w:r>
+        <w:rPr>
+          <w:b w:val="0"/>
+          <w:i w:val="0"/>
+        </w:rPr>
+        <w:t>El archivo para DBNeT trae los botones que crean los CSV (</w:t>
+      </w:r>
+      <w:r>
+        <w:rPr>
+          <w:b/>
+          <w:i w:val="0"/>
+        </w:rPr>
+        <w:t>Crear CSV</w:t>
+      </w:r>
+      <w:r>
+        <w:rPr>
+          <w:b w:val="0"/>
+          <w:i w:val="0"/>
+        </w:rPr>
+        <w:t xml:space="preserve"> y </w:t>
+      </w:r>
+      <w:r>
+        <w:rPr>
+          <w:b/>
+          <w:i w:val="0"/>
+        </w:rPr>
+        <w:t>Crear/Comprimir CSV</w:t>
+      </w:r>
+      <w:r>
+        <w:rPr>
+          <w:b w:val="0"/>
+          <w:i w:val="0"/>
+        </w:rPr>
+        <w:t>). La app le pone esos botones usando Excel, pero Excel viene configurado para que ningún programa pueda agregar botones a un archivo. Este ajuste le da ese permiso.</w:t>
+      </w:r>
+    </w:p>
+    <w:p>
+      <w:r>
+        <w:rPr>
+          <w:b w:val="0"/>
+          <w:i w:val="0"/>
+        </w:rPr>
+        <w:t xml:space="preserve">Si no se hace, la app llena las plantillas igual, pero se detiene al final, en «Preparando el archivo para DBNeT», con un mensaje que habla del «Centro de confianza». No se pierde nada: haz el ajuste y presiona </w:t>
+      </w:r>
+      <w:r>
+        <w:rPr>
+          <w:b/>
+          <w:i w:val="0"/>
+        </w:rPr>
+        <w:t>Llenar</w:t>
+      </w:r>
+      <w:r>
+        <w:rPr>
+          <w:b w:val="0"/>
+          <w:i w:val="0"/>
+        </w:rPr>
+        <w:t xml:space="preserve"> de nuevo.</w:t>
+      </w:r>
+    </w:p>
+    <w:p>
+      <w:pPr>
+        <w:pStyle w:val="Heading2"/>
+      </w:pPr>
+      <w:r>
+        <w:t>Cómo hacerlo</w:t>
       </w:r>
     </w:p>
     <w:p>
@@ -304,22 +380,19 @@
         <w:ind w:left="425" w:hanging="340"/>
       </w:pPr>
       <w:r>
-        <w:t>☐</w:t>
+        <w:rPr>
+          <w:b/>
+          <w:color w:val="0B5394"/>
+        </w:rPr>
+        <w:t>1.</w:t>
         <w:tab/>
       </w:r>
       <w:r>
         <w:rPr>
-          <w:b/>
-          <w:i w:val="0"/>
-        </w:rPr>
-        <w:t>Un computador con Windows y Excel instalado.</w:t>
-      </w:r>
-      <w:r>
-        <w:rPr>
           <w:b w:val="0"/>
           <w:i w:val="0"/>
         </w:rPr>
-        <w:t xml:space="preserve"> Tiene que ser el Excel de escritorio, no la versión web.</w:t>
+        <w:t>Abre Excel, con un libro en blanco.</w:t>
       </w:r>
     </w:p>
     <w:p>
@@ -331,22 +404,47 @@
         <w:ind w:left="425" w:hanging="340"/>
       </w:pPr>
       <w:r>
-        <w:t>☐</w:t>
+        <w:rPr>
+          <w:b/>
+          <w:color w:val="0B5394"/>
+        </w:rPr>
+        <w:t>2.</w:t>
         <w:tab/>
       </w:r>
       <w:r>
         <w:rPr>
+          <w:b w:val="0"/>
+          <w:i w:val="0"/>
+        </w:rPr>
+        <w:t xml:space="preserve">Entra a </w:t>
+      </w:r>
+      <w:r>
+        <w:rPr>
           <w:b/>
           <w:i w:val="0"/>
         </w:rPr>
-        <w:t>Conexión a internet.</w:t>
+        <w:t>Archivo</w:t>
       </w:r>
       <w:r>
         <w:rPr>
           <w:b w:val="0"/>
           <w:i w:val="0"/>
         </w:rPr>
-        <w:t xml:space="preserve"> Si trabajas fuera de la oficina, con la VPN conectada.</w:t>
+        <w:t xml:space="preserve"> → </w:t>
+      </w:r>
+      <w:r>
+        <w:rPr>
+          <w:b/>
+          <w:i w:val="0"/>
+        </w:rPr>
+        <w:t>Opciones</w:t>
+      </w:r>
+      <w:r>
+        <w:rPr>
+          <w:b w:val="0"/>
+          <w:i w:val="0"/>
+        </w:rPr>
+        <w:t>.</w:t>
       </w:r>
     </w:p>
     <w:p>
@@ -358,35 +456,33 @@
         <w:ind w:left="425" w:hanging="340"/>
       </w:pPr>
       <w:r>
-        <w:t>☐</w:t>
+        <w:rPr>
+          <w:b/>
+          <w:color w:val="0B5394"/>
+        </w:rPr>
+        <w:t>3.</w:t>
         <w:tab/>
       </w:r>
       <w:r>
         <w:rPr>
+          <w:b w:val="0"/>
+          <w:i w:val="0"/>
+        </w:rPr>
+        <w:t xml:space="preserve">En la lista de la izquierda, elige </w:t>
+      </w:r>
+      <w:r>
+        <w:rPr>
           <w:b/>
-        </w:rPr>
-        <w:t xml:space="preserve">El programa: el archivo </w:t>
-      </w:r>
-      <w:r>
-        <w:rPr>
-          <w:rFonts w:ascii="Consolas" w:hAnsi="Consolas"/>
-          <w:b/>
-          <w:sz w:val="20"/>
-        </w:rPr>
-        <w:t>Enlace XBRL.exe</w:t>
-      </w:r>
-      <w:r>
-        <w:rPr>
-          <w:b/>
+          <w:i w:val="0"/>
+        </w:rPr>
+        <w:t>Centro de confianza</w:t>
+      </w:r>
+      <w:r>
+        <w:rPr>
+          <w:b w:val="0"/>
+          <w:i w:val="0"/>
         </w:rPr>
         <w:t>.</w:t>
-      </w:r>
-      <w:r>
-        <w:rPr>
-          <w:b w:val="0"/>
-          <w:i w:val="0"/>
-        </w:rPr>
-        <w:t xml:space="preserve"> No se instala nada más.</w:t>
       </w:r>
     </w:p>
     <w:p>
@@ -398,49 +494,26 @@
         <w:ind w:left="425" w:hanging="340"/>
       </w:pPr>
       <w:r>
-        <w:t>☐</w:t>
+        <w:rPr>
+          <w:b/>
+          <w:color w:val="0B5394"/>
+        </w:rPr>
+        <w:t>4.</w:t>
         <w:tab/>
       </w:r>
       <w:r>
         <w:rPr>
+          <w:b w:val="0"/>
+          <w:i w:val="0"/>
+        </w:rPr>
+        <w:t xml:space="preserve">Presiona el botón </w:t>
+      </w:r>
+      <w:r>
+        <w:rPr>
           <w:b/>
           <w:i w:val="0"/>
         </w:rPr>
-        <w:t>Las plantillas de DBNeT de cada empresa.</w:t>
-      </w:r>
-      <w:r>
-        <w:rPr>
-          <w:b w:val="0"/>
-          <w:i w:val="0"/>
-        </w:rPr>
-        <w:t xml:space="preserve"> Son los archivos que terminan en </w:t>
-      </w:r>
-      <w:r>
-        <w:rPr>
-          <w:rFonts w:ascii="Consolas" w:hAnsi="Consolas"/>
-          <w:b w:val="0"/>
-          <w:i w:val="0"/>
-          <w:color w:val="1F1F1F"/>
-          <w:sz w:val="20"/>
-        </w:rPr>
-        <w:t>.xlsm</w:t>
-      </w:r>
-      <w:r>
-        <w:rPr>
-          <w:b w:val="0"/>
-          <w:i w:val="0"/>
-        </w:rPr>
-        <w:t xml:space="preserve"> que entrega DBNeT, sueltos o dentro de un </w:t>
-      </w:r>
-      <w:r>
-        <w:rPr>
-          <w:rFonts w:ascii="Consolas" w:hAnsi="Consolas"/>
-          <w:b w:val="0"/>
-          <w:i w:val="0"/>
-          <w:color w:val="1F1F1F"/>
-          <w:sz w:val="20"/>
-        </w:rPr>
-        <w:t>.zip</w:t>
+        <w:t>Configuración del Centro de confianza…</w:t>
       </w:r>
       <w:r>
         <w:rPr>
@@ -459,32 +532,26 @@
         <w:ind w:left="425" w:hanging="340"/>
       </w:pPr>
       <w:r>
-        <w:t>☐</w:t>
+        <w:rPr>
+          <w:b/>
+          <w:color w:val="0B5394"/>
+        </w:rPr>
+        <w:t>5.</w:t>
         <w:tab/>
       </w:r>
       <w:r>
         <w:rPr>
+          <w:b w:val="0"/>
+          <w:i w:val="0"/>
+        </w:rPr>
+        <w:t xml:space="preserve">En la lista de la izquierda, elige </w:t>
+      </w:r>
+      <w:r>
+        <w:rPr>
           <w:b/>
           <w:i w:val="0"/>
         </w:rPr>
-        <w:t>La planilla XBRL de la empresa en Workiva</w:t>
-      </w:r>
-      <w:r>
-        <w:rPr>
-          <w:b w:val="0"/>
-          <w:i w:val="0"/>
-        </w:rPr>
-        <w:t xml:space="preserve">, con el nombre exacto. Ejemplo: </w:t>
-      </w:r>
-      <w:r>
-        <w:rPr>
-          <w:rFonts w:ascii="Consolas" w:hAnsi="Consolas"/>
-          <w:b w:val="0"/>
-          <w:i w:val="0"/>
-          <w:color w:val="1F1F1F"/>
-          <w:sz w:val="20"/>
-        </w:rPr>
-        <w:t>E211 XBRL 09-2026</w:t>
+        <w:t>Configuración de macros</w:t>
       </w:r>
       <w:r>
         <w:rPr>
@@ -503,253 +570,10 @@
         <w:ind w:left="425" w:hanging="340"/>
       </w:pPr>
       <w:r>
-        <w:t>☐</w:t>
-        <w:tab/>
-      </w:r>
-      <w:r>
-        <w:rPr>
-          <w:b/>
-          <w:i w:val="0"/>
-        </w:rPr>
-        <w:t>Una opción de Excel activada</w:t>
-      </w:r>
-      <w:r>
-        <w:rPr>
-          <w:b w:val="0"/>
-          <w:i w:val="0"/>
-        </w:rPr>
-        <w:t>, una sola vez en ese computador (pasos abajo).</w:t>
-      </w:r>
-    </w:p>
-    <w:p>
-      <w:r>
-        <w:rPr>
-          <w:b w:val="0"/>
-          <w:i w:val="0"/>
-        </w:rPr>
-        <w:t>No necesitas usuario ni clave de Workiva: la app se conecta sola.</w:t>
-      </w:r>
-    </w:p>
-    <w:p>
-      <w:pPr>
-        <w:pStyle w:val="Heading2"/>
-      </w:pPr>
-      <w:r>
-        <w:t>Cómo activar la opción de Excel (una sola vez por computador)</w:t>
-      </w:r>
-    </w:p>
-    <w:p>
-      <w:r>
-        <w:rPr>
-          <w:b w:val="0"/>
-          <w:i w:val="0"/>
-        </w:rPr>
-        <w:t>La app usa Excel para armar el archivo final con sus botones. Sin esta opción, Excel no la deja poner los botones y el último paso falla con un mensaje que habla del «Centro de confianza».</w:t>
-      </w:r>
-    </w:p>
-    <w:p>
-      <w:pPr>
-        <w:tabs>
-          <w:tab w:pos="425" w:val="left"/>
-        </w:tabs>
-        <w:spacing w:after="60"/>
-        <w:ind w:left="425" w:hanging="340"/>
-      </w:pPr>
-      <w:r>
         <w:rPr>
           <w:b/>
           <w:color w:val="0B5394"/>
         </w:rPr>
-        <w:t>1.</w:t>
-        <w:tab/>
-      </w:r>
-      <w:r>
-        <w:rPr>
-          <w:b w:val="0"/>
-          <w:i w:val="0"/>
-        </w:rPr>
-        <w:t>Abre Excel, con un libro en blanco.</w:t>
-      </w:r>
-    </w:p>
-    <w:p>
-      <w:pPr>
-        <w:tabs>
-          <w:tab w:pos="425" w:val="left"/>
-        </w:tabs>
-        <w:spacing w:after="60"/>
-        <w:ind w:left="425" w:hanging="340"/>
-      </w:pPr>
-      <w:r>
-        <w:rPr>
-          <w:b/>
-          <w:color w:val="0B5394"/>
-        </w:rPr>
-        <w:t>2.</w:t>
-        <w:tab/>
-      </w:r>
-      <w:r>
-        <w:rPr>
-          <w:b w:val="0"/>
-          <w:i w:val="0"/>
-        </w:rPr>
-        <w:t xml:space="preserve">Entra a </w:t>
-      </w:r>
-      <w:r>
-        <w:rPr>
-          <w:b/>
-          <w:i w:val="0"/>
-        </w:rPr>
-        <w:t>Archivo</w:t>
-      </w:r>
-      <w:r>
-        <w:rPr>
-          <w:b w:val="0"/>
-          <w:i w:val="0"/>
-        </w:rPr>
-        <w:t xml:space="preserve"> → </w:t>
-      </w:r>
-      <w:r>
-        <w:rPr>
-          <w:b/>
-          <w:i w:val="0"/>
-        </w:rPr>
-        <w:t>Opciones</w:t>
-      </w:r>
-      <w:r>
-        <w:rPr>
-          <w:b w:val="0"/>
-          <w:i w:val="0"/>
-        </w:rPr>
-        <w:t>.</w:t>
-      </w:r>
-    </w:p>
-    <w:p>
-      <w:pPr>
-        <w:tabs>
-          <w:tab w:pos="425" w:val="left"/>
-        </w:tabs>
-        <w:spacing w:after="60"/>
-        <w:ind w:left="425" w:hanging="340"/>
-      </w:pPr>
-      <w:r>
-        <w:rPr>
-          <w:b/>
-          <w:color w:val="0B5394"/>
-        </w:rPr>
-        <w:t>3.</w:t>
-        <w:tab/>
-      </w:r>
-      <w:r>
-        <w:rPr>
-          <w:b w:val="0"/>
-          <w:i w:val="0"/>
-        </w:rPr>
-        <w:t xml:space="preserve">En la lista de la izquierda, elige </w:t>
-      </w:r>
-      <w:r>
-        <w:rPr>
-          <w:b/>
-          <w:i w:val="0"/>
-        </w:rPr>
-        <w:t>Centro de confianza</w:t>
-      </w:r>
-      <w:r>
-        <w:rPr>
-          <w:b w:val="0"/>
-          <w:i w:val="0"/>
-        </w:rPr>
-        <w:t>.</w:t>
-      </w:r>
-    </w:p>
-    <w:p>
-      <w:pPr>
-        <w:tabs>
-          <w:tab w:pos="425" w:val="left"/>
-        </w:tabs>
-        <w:spacing w:after="60"/>
-        <w:ind w:left="425" w:hanging="340"/>
-      </w:pPr>
-      <w:r>
-        <w:rPr>
-          <w:b/>
-          <w:color w:val="0B5394"/>
-        </w:rPr>
-        <w:t>4.</w:t>
-        <w:tab/>
-      </w:r>
-      <w:r>
-        <w:rPr>
-          <w:b w:val="0"/>
-          <w:i w:val="0"/>
-        </w:rPr>
-        <w:t xml:space="preserve">Presiona el botón </w:t>
-      </w:r>
-      <w:r>
-        <w:rPr>
-          <w:b/>
-          <w:i w:val="0"/>
-        </w:rPr>
-        <w:t>Configuración del Centro de confianza…</w:t>
-      </w:r>
-      <w:r>
-        <w:rPr>
-          <w:b w:val="0"/>
-          <w:i w:val="0"/>
-        </w:rPr>
-        <w:t>.</w:t>
-      </w:r>
-    </w:p>
-    <w:p>
-      <w:pPr>
-        <w:tabs>
-          <w:tab w:pos="425" w:val="left"/>
-        </w:tabs>
-        <w:spacing w:after="60"/>
-        <w:ind w:left="425" w:hanging="340"/>
-      </w:pPr>
-      <w:r>
-        <w:rPr>
-          <w:b/>
-          <w:color w:val="0B5394"/>
-        </w:rPr>
-        <w:t>5.</w:t>
-        <w:tab/>
-      </w:r>
-      <w:r>
-        <w:rPr>
-          <w:b w:val="0"/>
-          <w:i w:val="0"/>
-        </w:rPr>
-        <w:t xml:space="preserve">En la lista de la izquierda, elige </w:t>
-      </w:r>
-      <w:r>
-        <w:rPr>
-          <w:b/>
-          <w:i w:val="0"/>
-        </w:rPr>
-        <w:t>Configuración de macros</w:t>
-      </w:r>
-      <w:r>
-        <w:rPr>
-          <w:b w:val="0"/>
-          <w:i w:val="0"/>
-        </w:rPr>
-        <w:t>.</w:t>
-      </w:r>
-    </w:p>
-    <w:p>
-      <w:pPr>
-        <w:tabs>
-          <w:tab w:pos="425" w:val="left"/>
-        </w:tabs>
-        <w:spacing w:after="60"/>
-        <w:ind w:left="425" w:hanging="340"/>
-      </w:pPr>
-      <w:r>
-        <w:rPr>
-          <w:b/>
-          <w:color w:val="0B5394"/>
-        </w:rPr>
         <w:t>6.</w:t>
         <w:tab/>
       </w:r>
@@ -772,7 +596,7 @@
           <w:b w:val="0"/>
           <w:i w:val="0"/>
         </w:rPr>
-        <w:t>.</w:t>
+        <w:t xml:space="preserve"> (es la última de esa pantalla).</w:t>
       </w:r>
     </w:p>
     <w:p>
@@ -4306,25 +4130,7 @@
                 <w:i w:val="0"/>
                 <w:sz w:val="20"/>
               </w:rPr>
-              <w:t xml:space="preserve">El archivo salió como </w:t>
-            </w:r>
-            <w:r>
-              <w:rPr>
-                <w:rFonts w:ascii="Consolas" w:hAnsi="Consolas"/>
-                <w:b w:val="0"/>
-                <w:i w:val="0"/>
-                <w:color w:val="1F1F1F"/>
-                <w:sz w:val="20"/>
-              </w:rPr>
-              <w:t>.xlsx</w:t>
-            </w:r>
-            <w:r>
-              <w:rPr>
-                <w:b w:val="0"/>
-                <w:i w:val="0"/>
-                <w:sz w:val="20"/>
-              </w:rPr>
-              <w:t>, sin botones, porque no se pudo usar Excel</w:t>
+              <w:t>El archivo salió sin los botones que crean los CSV, porque no se pudo usar Excel</w:t>
             </w:r>
           </w:p>
         </w:tc>
@@ -6821,7 +6627,7 @@
           <w:b w:val="0"/>
           <w:i w:val="0"/>
         </w:rPr>
-        <w:t>En otro computador: copia el programa, activa la opción de Excel (sección «Antes de empezar») y elige como carpeta de trabajo la misma carpeta compartida, o una copia de ella.</w:t>
+        <w:t>En otro computador: copia el programa, haz el ajuste de Excel (sección «Antes de empezar») y elige como carpeta de trabajo la misma carpeta compartida, o una copia de ella.</w:t>
       </w:r>
     </w:p>
     <w:p>
@@ -8063,25 +7869,7 @@
                 <w:i w:val="0"/>
                 <w:sz w:val="20"/>
               </w:rPr>
-              <w:t xml:space="preserve">En esa carpeta no hay archivos </w:t>
-            </w:r>
-            <w:r>
-              <w:rPr>
-                <w:rFonts w:ascii="Consolas" w:hAnsi="Consolas"/>
-                <w:b w:val="0"/>
-                <w:i w:val="0"/>
-                <w:color w:val="1F1F1F"/>
-                <w:sz w:val="20"/>
-              </w:rPr>
-              <w:t>.xlsm</w:t>
-            </w:r>
-            <w:r>
-              <w:rPr>
-                <w:b w:val="0"/>
-                <w:i w:val="0"/>
-                <w:sz w:val="20"/>
-              </w:rPr>
-              <w:t xml:space="preserve"> de DBNeT</w:t>
+              <w:t>En esa carpeta no hay plantillas de DBNeT</w:t>
             </w:r>
           </w:p>
         </w:tc>
@@ -8739,7 +8527,7 @@
                 <w:i w:val="0"/>
                 <w:sz w:val="20"/>
               </w:rPr>
-              <w:t>Falta la opción de Excel en este computador</w:t>
+              <w:t>Falta el ajuste de Excel en este computador</w:t>
             </w:r>
           </w:p>
         </w:tc>
@@ -8758,7 +8546,7 @@
                 <w:i w:val="0"/>
                 <w:sz w:val="20"/>
               </w:rPr>
-              <w:t>Activarla (sección «Antes de empezar») y llenar de nuevo</w:t>
+              <w:t>Hacerlo (sección «Antes de empezar») y llenar de nuevo</w:t>
             </w:r>
           </w:p>
         </w:tc>
@@ -9313,25 +9101,7 @@
                 <w:i w:val="0"/>
                 <w:sz w:val="20"/>
               </w:rPr>
-              <w:t xml:space="preserve">El archivo termina en </w:t>
-            </w:r>
-            <w:r>
-              <w:rPr>
-                <w:rFonts w:ascii="Consolas" w:hAnsi="Consolas"/>
-                <w:b w:val="0"/>
-                <w:i w:val="0"/>
-                <w:color w:val="1F1F1F"/>
-                <w:sz w:val="20"/>
-              </w:rPr>
-              <w:t>.xlsx</w:t>
-            </w:r>
-            <w:r>
-              <w:rPr>
-                <w:b w:val="0"/>
-                <w:i w:val="0"/>
-                <w:sz w:val="20"/>
-              </w:rPr>
-              <w:t xml:space="preserve"> y no tiene botones</w:t>
+              <w:t>El archivo no tiene los botones para crear los CSV</w:t>
             </w:r>
           </w:p>
         </w:tc>

</xml_diff>